<commit_message>
Report and Chapters 2-3: the eleven semicolons in the running text become full stops
The semicolons that separate references inside a citation bracket stay,
as Harvard referencing requires. The six sentences that Chapters 2 and 3
share with the report are changed in the same way, so the chapter files
and the combined Chapters 1-4, 1-5 and 1-6 files read the same as the
report. The RED_changes report shows each change in red.

Co-Authored-By: Claude Fable 5.1 <noreply@anthropic.com>
Claude-Session: https://claude.ai/code/session_01QHSSv245Aernyaebt7V5kS
</commit_message>
<xml_diff>
--- a/docs/Yasir_Thesis_Chapter2_clean.docx
+++ b/docs/Yasir_Thesis_Chapter2_clean.docx
@@ -2069,7 +2069,14 @@
                 <w:rFonts w:ascii="Palatino Linotype" w:hAnsi="Palatino Linotype" w:cs="Palatino Linotype"/>
                 <w:sz w:val="20"/>
               </w:rPr>
-              <w:t>Within healthcare consent or authorisation; otherwise exclude</w:t>
+              <w:t xml:space="preserve">Within healthcare consent or authorisation</w:t>
+            </w:r>
+            <w:r>
+              <w:rPr>
+                <w:rFonts w:ascii="Palatino Linotype" w:hAnsi="Palatino Linotype" w:cs="Palatino Linotype"/>
+                <w:sz w:val="20"/>
+              </w:rPr>
+              <w:t xml:space="preserve">. Otherwise exclude</w:t>
             </w:r>
           </w:p>
         </w:tc>
@@ -2214,7 +2221,14 @@
                 <w:rFonts w:ascii="Palatino Linotype" w:hAnsi="Palatino Linotype" w:cs="Palatino Linotype"/>
                 <w:sz w:val="20"/>
               </w:rPr>
-              <w:t>Relevant to a review question; otherwise exclude</w:t>
+              <w:t xml:space="preserve">Relevant to a review question</w:t>
+            </w:r>
+            <w:r>
+              <w:rPr>
+                <w:rFonts w:ascii="Palatino Linotype" w:hAnsi="Palatino Linotype" w:cs="Palatino Linotype"/>
+                <w:sz w:val="20"/>
+              </w:rPr>
+              <w:t xml:space="preserve">. Otherwise exclude</w:t>
             </w:r>
           </w:p>
         </w:tc>
@@ -2552,7 +2566,13 @@
     <w:p>
       <w:pPr/>
       <w:r>
-        <w:t>Each question was answered Yes or No, and any study which has at least three Yes answers to the six questions, and meets the eligibility criteria of Step 2, is included in this SLR. These questions decide whether a study enters the review; whether it satisfies the requirements of Section 2.2 is decided separately in Section 2.4. Of the 39 full-text studies, 25 satisfied the criteria, as shown in Table 2.3. Each included study was then coded Yes or No against each of the six requirements, Req 1 to Req 6, with a page reference for every Yes. A study is core if its gap-impact verdict is contradicts, weakens or narrows, or if it provides a multi-party approval mechanism. Of the 25 included studies, S1 to S25, 23 are core studies and 2 are supporting studies (Albalwy, Brass &amp; Davies 2021; Li et al. 2026a).</w:t>
+        <w:t xml:space="preserve">Each question was answered Yes or No, and any study which has at least three Yes answers to the six questions, and meets the eligibility criteria of Step 2, is included in this SLR. These questions decide whether a study enters the review</w:t>
+      </w:r>
+      <w:r>
+        <w:t xml:space="preserve">. Whether it satisfies</w:t>
+      </w:r>
+      <w:r>
+        <w:t xml:space="preserve"> the requirements of Section 2.2 is decided separately in Section 2.4. Of the 39 full-text studies, 25 satisfied the criteria, as shown in Table 2.3. Each included study was then coded Yes or No against each of the six requirements, Req 1 to Req 6, with a page reference for every Yes. A study is core if its gap-impact verdict is contradicts, weakens or narrows, or if it provides a multi-party approval mechanism. Of the 25 included studies, S1 to S25, 23 are core studies and 2 are supporting studies (Albalwy, Brass &amp; Davies 2021; Li et al. 2026a).</w:t>
       </w:r>
     </w:p>
     <w:p>
@@ -22918,6 +22938,8 @@
       </w:pPr>
       <w:r>
         <w:t>•</w:t>
+      </w:r>
+      <w:r>
         <w:tab/>
       </w:r>
       <w:r>
@@ -22928,7 +22950,13 @@
         <w:t>Inability to bind purpose and data scope to the same decision as identity, authority and approval (Req 4):</w:t>
       </w:r>
       <w:r>
-        <w:t xml:space="preserve"> Policy controls on purpose or data scope are enforced by 10 of the 25 studies (Table 2.10), only six of which evaluate purpose-of-use as part of the access decision, and in none of them are they bound to the same decision as identity, authority and multi-party approval; in the reviewed studies, multi-party approval is never conjoined with a purpose condition (Madine et al. 2020; Punia et al. 2025; Tan, Chi &amp; Lam 2024). Without this binding, a valid identity and sufficient approvals can be used to obtain data outside the authorised scope.</w:t>
+        <w:t xml:space="preserve"> Policy controls on purpose or data scope are enforced by 10 of the 25 studies (Table 2.10), only six of which evaluate purpose-of-use as part of the access decision, and in none of them are they bound to the same decision as identity, authority and multi-party approval</w:t>
+      </w:r>
+      <w:r>
+        <w:t xml:space="preserve">. In the reviewed studies</w:t>
+      </w:r>
+      <w:r>
+        <w:t xml:space="preserve">, multi-party approval is never conjoined with a purpose condition (Madine et al. 2020; Punia et al. 2025; Tan, Chi &amp; Lam 2024). Without this binding, a valid identity and sufficient approvals can be used to obtain data outside the authorised scope.</w:t>
       </w:r>
     </w:p>
     <w:p>

</xml_diff>